<commit_message>
Revision de documentos y correccion
</commit_message>
<xml_diff>
--- a/Entregables/ERS_Acueducto_Bodegas_Pilas.docx
+++ b/Entregables/ERS_Acueducto_Bodegas_Pilas.docx
@@ -189,12 +189,21 @@
           <w:szCs w:val="20"/>
         </w:rPr>
       </w:pPr>
+      <w:proofErr w:type="spellStart"/>
       <w:r>
         <w:rPr>
           <w:sz w:val="20"/>
           <w:szCs w:val="20"/>
         </w:rPr>
-        <w:t>Mariangel Arias Alfaro – C4C688</w:t>
+        <w:t>Mariangel</w:t>
+      </w:r>
+      <w:proofErr w:type="spellEnd"/>
+      <w:r>
+        <w:rPr>
+          <w:sz w:val="20"/>
+          <w:szCs w:val="20"/>
+        </w:rPr>
+        <w:t xml:space="preserve"> Arias Alfaro – C4C688</w:t>
       </w:r>
     </w:p>
     <w:p>
@@ -270,7 +279,23 @@
           <w:sz w:val="20"/>
           <w:szCs w:val="20"/>
         </w:rPr>
-        <w:t>James Mcintosh Molina</w:t>
+        <w:t xml:space="preserve">James </w:t>
+      </w:r>
+      <w:proofErr w:type="spellStart"/>
+      <w:r>
+        <w:rPr>
+          <w:sz w:val="20"/>
+          <w:szCs w:val="20"/>
+        </w:rPr>
+        <w:t>Mcintosh</w:t>
+      </w:r>
+      <w:proofErr w:type="spellEnd"/>
+      <w:r>
+        <w:rPr>
+          <w:sz w:val="20"/>
+          <w:szCs w:val="20"/>
+        </w:rPr>
+        <w:t xml:space="preserve"> Molina</w:t>
       </w:r>
     </w:p>
     <w:p>
@@ -283,7 +308,15 @@
           <w:sz w:val="20"/>
           <w:szCs w:val="20"/>
         </w:rPr>
-        <w:t>Fecha de entrega: [COMPLETAR]</w:t>
+        <w:t xml:space="preserve">Fecha de entrega: </w:t>
+      </w:r>
+      <w:r>
+        <w:rPr>
+          <w:color w:val="C00000"/>
+          <w:sz w:val="20"/>
+          <w:szCs w:val="20"/>
+        </w:rPr>
+        <w:t>18/09/2026</w:t>
       </w:r>
     </w:p>
     <w:p>
@@ -316,7 +349,7 @@
     </w:p>
     <w:p>
       <w:pPr>
-        <w:pStyle w:val="Ttulo1"/>
+        <w:pStyle w:val="Heading1"/>
         <w:pBdr>
           <w:bottom w:val="single" w:sz="6" w:space="0" w:color="1F3864"/>
         </w:pBdr>
@@ -375,12 +408,6 @@
         <w:gridCol w:w="4340"/>
       </w:tblGrid>
       <w:tr>
-        <w:tblPrEx>
-          <w:tblCellMar>
-            <w:top w:w="0" w:type="dxa"/>
-            <w:bottom w:w="0" w:type="dxa"/>
-          </w:tblCellMar>
-        </w:tblPrEx>
         <w:trPr>
           <w:tblHeader/>
         </w:trPr>
@@ -486,12 +513,6 @@
         </w:tc>
       </w:tr>
       <w:tr>
-        <w:tblPrEx>
-          <w:tblCellMar>
-            <w:top w:w="0" w:type="dxa"/>
-            <w:bottom w:w="0" w:type="dxa"/>
-          </w:tblCellMar>
-        </w:tblPrEx>
         <w:tc>
           <w:tcPr>
             <w:tcW w:w="1400" w:type="dxa"/>
@@ -530,7 +551,7 @@
                 <w:sz w:val="19"/>
                 <w:szCs w:val="19"/>
               </w:rPr>
-              <w:t>[COMPLETAR]</w:t>
+              <w:t>18/09/2026</w:t>
             </w:r>
           </w:p>
         </w:tc>
@@ -578,12 +599,6 @@
         </w:tc>
       </w:tr>
       <w:tr>
-        <w:tblPrEx>
-          <w:tblCellMar>
-            <w:top w:w="0" w:type="dxa"/>
-            <w:bottom w:w="0" w:type="dxa"/>
-          </w:tblCellMar>
-        </w:tblPrEx>
         <w:tc>
           <w:tcPr>
             <w:tcW w:w="1400" w:type="dxa"/>
@@ -642,12 +657,6 @@
         </w:tc>
       </w:tr>
       <w:tr>
-        <w:tblPrEx>
-          <w:tblCellMar>
-            <w:top w:w="0" w:type="dxa"/>
-            <w:bottom w:w="0" w:type="dxa"/>
-          </w:tblCellMar>
-        </w:tblPrEx>
         <w:tc>
           <w:tcPr>
             <w:tcW w:w="1400" w:type="dxa"/>
@@ -732,7 +741,7 @@
       <w:sdtContent>
         <w:p>
           <w:pPr>
-            <w:pStyle w:val="TDC1"/>
+            <w:pStyle w:val="TOC1"/>
             <w:tabs>
               <w:tab w:val="right" w:leader="dot" w:pos="9710"/>
             </w:tabs>
@@ -752,7 +761,7 @@
           <w:hyperlink w:anchor="_Toc240358099" w:history="1">
             <w:r>
               <w:rPr>
-                <w:rStyle w:val="Hipervnculo"/>
+                <w:rStyle w:val="Hyperlink"/>
                 <w:b/>
                 <w:bCs/>
                 <w:noProof/>
@@ -804,7 +813,7 @@
         </w:p>
         <w:p>
           <w:pPr>
-            <w:pStyle w:val="TDC1"/>
+            <w:pStyle w:val="TOC1"/>
             <w:tabs>
               <w:tab w:val="right" w:leader="dot" w:pos="9710"/>
             </w:tabs>
@@ -815,7 +824,7 @@
           <w:hyperlink w:anchor="_Toc240358100" w:history="1">
             <w:r>
               <w:rPr>
-                <w:rStyle w:val="Hipervnculo"/>
+                <w:rStyle w:val="Hyperlink"/>
                 <w:b/>
                 <w:bCs/>
                 <w:noProof/>
@@ -867,7 +876,7 @@
         </w:p>
         <w:p>
           <w:pPr>
-            <w:pStyle w:val="TDC2"/>
+            <w:pStyle w:val="TOC2"/>
             <w:tabs>
               <w:tab w:val="right" w:leader="dot" w:pos="9710"/>
             </w:tabs>
@@ -878,7 +887,7 @@
           <w:hyperlink w:anchor="_Toc240358101" w:history="1">
             <w:r>
               <w:rPr>
-                <w:rStyle w:val="Hipervnculo"/>
+                <w:rStyle w:val="Hyperlink"/>
                 <w:b/>
                 <w:bCs/>
                 <w:noProof/>
@@ -930,7 +939,7 @@
         </w:p>
         <w:p>
           <w:pPr>
-            <w:pStyle w:val="TDC2"/>
+            <w:pStyle w:val="TOC2"/>
             <w:tabs>
               <w:tab w:val="right" w:leader="dot" w:pos="9710"/>
             </w:tabs>
@@ -941,7 +950,7 @@
           <w:hyperlink w:anchor="_Toc240358102" w:history="1">
             <w:r>
               <w:rPr>
-                <w:rStyle w:val="Hipervnculo"/>
+                <w:rStyle w:val="Hyperlink"/>
                 <w:b/>
                 <w:bCs/>
                 <w:noProof/>
@@ -993,7 +1002,7 @@
         </w:p>
         <w:p>
           <w:pPr>
-            <w:pStyle w:val="TDC2"/>
+            <w:pStyle w:val="TOC2"/>
             <w:tabs>
               <w:tab w:val="right" w:leader="dot" w:pos="9710"/>
             </w:tabs>
@@ -1004,7 +1013,7 @@
           <w:hyperlink w:anchor="_Toc240358103" w:history="1">
             <w:r>
               <w:rPr>
-                <w:rStyle w:val="Hipervnculo"/>
+                <w:rStyle w:val="Hyperlink"/>
                 <w:b/>
                 <w:bCs/>
                 <w:noProof/>
@@ -1056,7 +1065,7 @@
         </w:p>
         <w:p>
           <w:pPr>
-            <w:pStyle w:val="TDC2"/>
+            <w:pStyle w:val="TOC2"/>
             <w:tabs>
               <w:tab w:val="right" w:leader="dot" w:pos="9710"/>
             </w:tabs>
@@ -1067,7 +1076,7 @@
           <w:hyperlink w:anchor="_Toc240358104" w:history="1">
             <w:r>
               <w:rPr>
-                <w:rStyle w:val="Hipervnculo"/>
+                <w:rStyle w:val="Hyperlink"/>
                 <w:b/>
                 <w:bCs/>
                 <w:noProof/>
@@ -1119,7 +1128,7 @@
         </w:p>
         <w:p>
           <w:pPr>
-            <w:pStyle w:val="TDC2"/>
+            <w:pStyle w:val="TOC2"/>
             <w:tabs>
               <w:tab w:val="right" w:leader="dot" w:pos="9710"/>
             </w:tabs>
@@ -1130,7 +1139,7 @@
           <w:hyperlink w:anchor="_Toc240358105" w:history="1">
             <w:r>
               <w:rPr>
-                <w:rStyle w:val="Hipervnculo"/>
+                <w:rStyle w:val="Hyperlink"/>
                 <w:b/>
                 <w:bCs/>
                 <w:noProof/>
@@ -1182,7 +1191,7 @@
         </w:p>
         <w:p>
           <w:pPr>
-            <w:pStyle w:val="TDC1"/>
+            <w:pStyle w:val="TOC1"/>
             <w:tabs>
               <w:tab w:val="right" w:leader="dot" w:pos="9710"/>
             </w:tabs>
@@ -1193,7 +1202,7 @@
           <w:hyperlink w:anchor="_Toc240358106" w:history="1">
             <w:r>
               <w:rPr>
-                <w:rStyle w:val="Hipervnculo"/>
+                <w:rStyle w:val="Hyperlink"/>
                 <w:b/>
                 <w:bCs/>
                 <w:noProof/>
@@ -1245,7 +1254,7 @@
         </w:p>
         <w:p>
           <w:pPr>
-            <w:pStyle w:val="TDC2"/>
+            <w:pStyle w:val="TOC2"/>
             <w:tabs>
               <w:tab w:val="right" w:leader="dot" w:pos="9710"/>
             </w:tabs>
@@ -1256,7 +1265,7 @@
           <w:hyperlink w:anchor="_Toc240358107" w:history="1">
             <w:r>
               <w:rPr>
-                <w:rStyle w:val="Hipervnculo"/>
+                <w:rStyle w:val="Hyperlink"/>
                 <w:b/>
                 <w:bCs/>
                 <w:noProof/>
@@ -1308,7 +1317,7 @@
         </w:p>
         <w:p>
           <w:pPr>
-            <w:pStyle w:val="TDC2"/>
+            <w:pStyle w:val="TOC2"/>
             <w:tabs>
               <w:tab w:val="right" w:leader="dot" w:pos="9710"/>
             </w:tabs>
@@ -1319,7 +1328,7 @@
           <w:hyperlink w:anchor="_Toc240358108" w:history="1">
             <w:r>
               <w:rPr>
-                <w:rStyle w:val="Hipervnculo"/>
+                <w:rStyle w:val="Hyperlink"/>
                 <w:b/>
                 <w:bCs/>
                 <w:noProof/>
@@ -1371,7 +1380,7 @@
         </w:p>
         <w:p>
           <w:pPr>
-            <w:pStyle w:val="TDC2"/>
+            <w:pStyle w:val="TOC2"/>
             <w:tabs>
               <w:tab w:val="right" w:leader="dot" w:pos="9710"/>
             </w:tabs>
@@ -1382,7 +1391,7 @@
           <w:hyperlink w:anchor="_Toc240358109" w:history="1">
             <w:r>
               <w:rPr>
-                <w:rStyle w:val="Hipervnculo"/>
+                <w:rStyle w:val="Hyperlink"/>
                 <w:b/>
                 <w:bCs/>
                 <w:noProof/>
@@ -1434,7 +1443,7 @@
         </w:p>
         <w:p>
           <w:pPr>
-            <w:pStyle w:val="TDC2"/>
+            <w:pStyle w:val="TOC2"/>
             <w:tabs>
               <w:tab w:val="right" w:leader="dot" w:pos="9710"/>
             </w:tabs>
@@ -1445,7 +1454,7 @@
           <w:hyperlink w:anchor="_Toc240358110" w:history="1">
             <w:r>
               <w:rPr>
-                <w:rStyle w:val="Hipervnculo"/>
+                <w:rStyle w:val="Hyperlink"/>
                 <w:b/>
                 <w:bCs/>
                 <w:noProof/>
@@ -1497,7 +1506,7 @@
         </w:p>
         <w:p>
           <w:pPr>
-            <w:pStyle w:val="TDC2"/>
+            <w:pStyle w:val="TOC2"/>
             <w:tabs>
               <w:tab w:val="right" w:leader="dot" w:pos="9710"/>
             </w:tabs>
@@ -1508,7 +1517,7 @@
           <w:hyperlink w:anchor="_Toc240358111" w:history="1">
             <w:r>
               <w:rPr>
-                <w:rStyle w:val="Hipervnculo"/>
+                <w:rStyle w:val="Hyperlink"/>
                 <w:b/>
                 <w:bCs/>
                 <w:noProof/>
@@ -1560,7 +1569,7 @@
         </w:p>
         <w:p>
           <w:pPr>
-            <w:pStyle w:val="TDC1"/>
+            <w:pStyle w:val="TOC1"/>
             <w:tabs>
               <w:tab w:val="right" w:leader="dot" w:pos="9710"/>
             </w:tabs>
@@ -1571,7 +1580,7 @@
           <w:hyperlink w:anchor="_Toc240358112" w:history="1">
             <w:r>
               <w:rPr>
-                <w:rStyle w:val="Hipervnculo"/>
+                <w:rStyle w:val="Hyperlink"/>
                 <w:b/>
                 <w:bCs/>
                 <w:noProof/>
@@ -1623,7 +1632,7 @@
         </w:p>
         <w:p>
           <w:pPr>
-            <w:pStyle w:val="TDC2"/>
+            <w:pStyle w:val="TOC2"/>
             <w:tabs>
               <w:tab w:val="right" w:leader="dot" w:pos="9710"/>
             </w:tabs>
@@ -1634,7 +1643,7 @@
           <w:hyperlink w:anchor="_Toc240358113" w:history="1">
             <w:r>
               <w:rPr>
-                <w:rStyle w:val="Hipervnculo"/>
+                <w:rStyle w:val="Hyperlink"/>
                 <w:b/>
                 <w:bCs/>
                 <w:noProof/>
@@ -1686,7 +1695,7 @@
         </w:p>
         <w:p>
           <w:pPr>
-            <w:pStyle w:val="TDC2"/>
+            <w:pStyle w:val="TOC2"/>
             <w:tabs>
               <w:tab w:val="right" w:leader="dot" w:pos="9710"/>
             </w:tabs>
@@ -1697,7 +1706,7 @@
           <w:hyperlink w:anchor="_Toc240358114" w:history="1">
             <w:r>
               <w:rPr>
-                <w:rStyle w:val="Hipervnculo"/>
+                <w:rStyle w:val="Hyperlink"/>
                 <w:b/>
                 <w:bCs/>
                 <w:noProof/>
@@ -1749,7 +1758,7 @@
         </w:p>
         <w:p>
           <w:pPr>
-            <w:pStyle w:val="TDC2"/>
+            <w:pStyle w:val="TOC2"/>
             <w:tabs>
               <w:tab w:val="right" w:leader="dot" w:pos="9710"/>
             </w:tabs>
@@ -1760,7 +1769,7 @@
           <w:hyperlink w:anchor="_Toc240358115" w:history="1">
             <w:r>
               <w:rPr>
-                <w:rStyle w:val="Hipervnculo"/>
+                <w:rStyle w:val="Hyperlink"/>
                 <w:b/>
                 <w:bCs/>
                 <w:noProof/>
@@ -1812,7 +1821,7 @@
         </w:p>
         <w:p>
           <w:pPr>
-            <w:pStyle w:val="TDC2"/>
+            <w:pStyle w:val="TOC2"/>
             <w:tabs>
               <w:tab w:val="right" w:leader="dot" w:pos="9710"/>
             </w:tabs>
@@ -1823,7 +1832,7 @@
           <w:hyperlink w:anchor="_Toc240358116" w:history="1">
             <w:r>
               <w:rPr>
-                <w:rStyle w:val="Hipervnculo"/>
+                <w:rStyle w:val="Hyperlink"/>
                 <w:b/>
                 <w:bCs/>
                 <w:noProof/>
@@ -1875,7 +1884,7 @@
         </w:p>
         <w:p>
           <w:pPr>
-            <w:pStyle w:val="TDC1"/>
+            <w:pStyle w:val="TOC1"/>
             <w:tabs>
               <w:tab w:val="right" w:leader="dot" w:pos="9710"/>
             </w:tabs>
@@ -1886,7 +1895,7 @@
           <w:hyperlink w:anchor="_Toc240358117" w:history="1">
             <w:r>
               <w:rPr>
-                <w:rStyle w:val="Hipervnculo"/>
+                <w:rStyle w:val="Hyperlink"/>
                 <w:b/>
                 <w:bCs/>
                 <w:noProof/>
@@ -1938,7 +1947,7 @@
         </w:p>
         <w:p>
           <w:pPr>
-            <w:pStyle w:val="TDC2"/>
+            <w:pStyle w:val="TOC2"/>
             <w:tabs>
               <w:tab w:val="right" w:leader="dot" w:pos="9710"/>
             </w:tabs>
@@ -1949,7 +1958,7 @@
           <w:hyperlink w:anchor="_Toc240358118" w:history="1">
             <w:r>
               <w:rPr>
-                <w:rStyle w:val="Hipervnculo"/>
+                <w:rStyle w:val="Hyperlink"/>
                 <w:b/>
                 <w:bCs/>
                 <w:noProof/>
@@ -2001,7 +2010,7 @@
         </w:p>
         <w:p>
           <w:pPr>
-            <w:pStyle w:val="TDC2"/>
+            <w:pStyle w:val="TOC2"/>
             <w:tabs>
               <w:tab w:val="right" w:leader="dot" w:pos="9710"/>
             </w:tabs>
@@ -2012,7 +2021,7 @@
           <w:hyperlink w:anchor="_Toc240358119" w:history="1">
             <w:r>
               <w:rPr>
-                <w:rStyle w:val="Hipervnculo"/>
+                <w:rStyle w:val="Hyperlink"/>
                 <w:b/>
                 <w:bCs/>
                 <w:noProof/>
@@ -2064,7 +2073,7 @@
         </w:p>
         <w:p>
           <w:pPr>
-            <w:pStyle w:val="TDC1"/>
+            <w:pStyle w:val="TOC1"/>
             <w:tabs>
               <w:tab w:val="right" w:leader="dot" w:pos="9710"/>
             </w:tabs>
@@ -2075,7 +2084,7 @@
           <w:hyperlink w:anchor="_Toc240358120" w:history="1">
             <w:r>
               <w:rPr>
-                <w:rStyle w:val="Hipervnculo"/>
+                <w:rStyle w:val="Hyperlink"/>
                 <w:b/>
                 <w:bCs/>
                 <w:noProof/>
@@ -2127,7 +2136,7 @@
         </w:p>
         <w:p>
           <w:pPr>
-            <w:pStyle w:val="TDC1"/>
+            <w:pStyle w:val="TOC1"/>
             <w:tabs>
               <w:tab w:val="right" w:leader="dot" w:pos="9710"/>
             </w:tabs>
@@ -2138,7 +2147,7 @@
           <w:hyperlink w:anchor="_Toc240358121" w:history="1">
             <w:r>
               <w:rPr>
-                <w:rStyle w:val="Hipervnculo"/>
+                <w:rStyle w:val="Hyperlink"/>
                 <w:b/>
                 <w:bCs/>
                 <w:noProof/>
@@ -2190,7 +2199,7 @@
         </w:p>
         <w:p>
           <w:pPr>
-            <w:pStyle w:val="TDC1"/>
+            <w:pStyle w:val="TOC1"/>
             <w:tabs>
               <w:tab w:val="right" w:leader="dot" w:pos="9710"/>
             </w:tabs>
@@ -2201,7 +2210,7 @@
           <w:hyperlink w:anchor="_Toc240358122" w:history="1">
             <w:r>
               <w:rPr>
-                <w:rStyle w:val="Hipervnculo"/>
+                <w:rStyle w:val="Hyperlink"/>
                 <w:b/>
                 <w:bCs/>
                 <w:noProof/>
@@ -2265,7 +2274,7 @@
     </w:p>
     <w:p>
       <w:pPr>
-        <w:pStyle w:val="Ttulo1"/>
+        <w:pStyle w:val="Heading1"/>
         <w:pBdr>
           <w:bottom w:val="single" w:sz="6" w:space="0" w:color="1F3864"/>
         </w:pBdr>
@@ -2287,7 +2296,7 @@
     </w:p>
     <w:p>
       <w:pPr>
-        <w:pStyle w:val="Ttulo2"/>
+        <w:pStyle w:val="Heading2"/>
         <w:spacing w:before="240" w:after="120"/>
       </w:pPr>
       <w:bookmarkStart w:id="2" w:name="_Toc240358101"/>
@@ -2313,7 +2322,7 @@
     </w:p>
     <w:p>
       <w:pPr>
-        <w:pStyle w:val="Ttulo2"/>
+        <w:pStyle w:val="Heading2"/>
         <w:spacing w:before="240" w:after="120"/>
       </w:pPr>
       <w:bookmarkStart w:id="3" w:name="_Toc240358102"/>
@@ -2339,7 +2348,7 @@
     </w:p>
     <w:p>
       <w:pPr>
-        <w:pStyle w:val="Ttulo2"/>
+        <w:pStyle w:val="Heading2"/>
         <w:spacing w:before="240" w:after="120"/>
       </w:pPr>
       <w:bookmarkStart w:id="4" w:name="_Toc240358103"/>
@@ -2377,12 +2386,6 @@
         <w:gridCol w:w="7940"/>
       </w:tblGrid>
       <w:tr>
-        <w:tblPrEx>
-          <w:tblCellMar>
-            <w:top w:w="0" w:type="dxa"/>
-            <w:bottom w:w="0" w:type="dxa"/>
-          </w:tblCellMar>
-        </w:tblPrEx>
         <w:trPr>
           <w:tblHeader/>
         </w:trPr>
@@ -2438,12 +2441,6 @@
         </w:tc>
       </w:tr>
       <w:tr>
-        <w:tblPrEx>
-          <w:tblCellMar>
-            <w:top w:w="0" w:type="dxa"/>
-            <w:bottom w:w="0" w:type="dxa"/>
-          </w:tblCellMar>
-        </w:tblPrEx>
         <w:tc>
           <w:tcPr>
             <w:tcW w:w="2400" w:type="dxa"/>
@@ -2488,12 +2485,6 @@
         </w:tc>
       </w:tr>
       <w:tr>
-        <w:tblPrEx>
-          <w:tblCellMar>
-            <w:top w:w="0" w:type="dxa"/>
-            <w:bottom w:w="0" w:type="dxa"/>
-          </w:tblCellMar>
-        </w:tblPrEx>
         <w:tc>
           <w:tcPr>
             <w:tcW w:w="2400" w:type="dxa"/>
@@ -2540,12 +2531,6 @@
         </w:tc>
       </w:tr>
       <w:tr>
-        <w:tblPrEx>
-          <w:tblCellMar>
-            <w:top w:w="0" w:type="dxa"/>
-            <w:bottom w:w="0" w:type="dxa"/>
-          </w:tblCellMar>
-        </w:tblPrEx>
         <w:tc>
           <w:tcPr>
             <w:tcW w:w="2400" w:type="dxa"/>
@@ -2590,12 +2575,6 @@
         </w:tc>
       </w:tr>
       <w:tr>
-        <w:tblPrEx>
-          <w:tblCellMar>
-            <w:top w:w="0" w:type="dxa"/>
-            <w:bottom w:w="0" w:type="dxa"/>
-          </w:tblCellMar>
-        </w:tblPrEx>
         <w:tc>
           <w:tcPr>
             <w:tcW w:w="2400" w:type="dxa"/>
@@ -2642,12 +2621,6 @@
         </w:tc>
       </w:tr>
       <w:tr>
-        <w:tblPrEx>
-          <w:tblCellMar>
-            <w:top w:w="0" w:type="dxa"/>
-            <w:bottom w:w="0" w:type="dxa"/>
-          </w:tblCellMar>
-        </w:tblPrEx>
         <w:tc>
           <w:tcPr>
             <w:tcW w:w="2400" w:type="dxa"/>
@@ -2692,12 +2665,6 @@
         </w:tc>
       </w:tr>
       <w:tr>
-        <w:tblPrEx>
-          <w:tblCellMar>
-            <w:top w:w="0" w:type="dxa"/>
-            <w:bottom w:w="0" w:type="dxa"/>
-          </w:tblCellMar>
-        </w:tblPrEx>
         <w:tc>
           <w:tcPr>
             <w:tcW w:w="2400" w:type="dxa"/>
@@ -2744,12 +2711,6 @@
         </w:tc>
       </w:tr>
       <w:tr>
-        <w:tblPrEx>
-          <w:tblCellMar>
-            <w:top w:w="0" w:type="dxa"/>
-            <w:bottom w:w="0" w:type="dxa"/>
-          </w:tblCellMar>
-        </w:tblPrEx>
         <w:tc>
           <w:tcPr>
             <w:tcW w:w="2400" w:type="dxa"/>
@@ -2794,12 +2755,6 @@
         </w:tc>
       </w:tr>
       <w:tr>
-        <w:tblPrEx>
-          <w:tblCellMar>
-            <w:top w:w="0" w:type="dxa"/>
-            <w:bottom w:w="0" w:type="dxa"/>
-          </w:tblCellMar>
-        </w:tblPrEx>
         <w:tc>
           <w:tcPr>
             <w:tcW w:w="2400" w:type="dxa"/>
@@ -2856,12 +2811,6 @@
         </w:tc>
       </w:tr>
       <w:tr>
-        <w:tblPrEx>
-          <w:tblCellMar>
-            <w:top w:w="0" w:type="dxa"/>
-            <w:bottom w:w="0" w:type="dxa"/>
-          </w:tblCellMar>
-        </w:tblPrEx>
         <w:tc>
           <w:tcPr>
             <w:tcW w:w="2400" w:type="dxa"/>
@@ -2920,7 +2869,7 @@
     </w:tbl>
     <w:p>
       <w:pPr>
-        <w:pStyle w:val="Ttulo2"/>
+        <w:pStyle w:val="Heading2"/>
         <w:spacing w:before="240" w:after="120"/>
       </w:pPr>
       <w:bookmarkStart w:id="5" w:name="_Toc240358104"/>
@@ -2953,7 +2902,7 @@
     </w:p>
     <w:p>
       <w:pPr>
-        <w:pStyle w:val="Prrafodelista"/>
+        <w:pStyle w:val="ListParagraph"/>
         <w:numPr>
           <w:ilvl w:val="0"/>
           <w:numId w:val="2"/>
@@ -2972,7 +2921,7 @@
     </w:p>
     <w:p>
       <w:pPr>
-        <w:pStyle w:val="Prrafodelista"/>
+        <w:pStyle w:val="ListParagraph"/>
         <w:numPr>
           <w:ilvl w:val="0"/>
           <w:numId w:val="2"/>
@@ -2992,7 +2941,7 @@
     </w:p>
     <w:p>
       <w:pPr>
-        <w:pStyle w:val="Prrafodelista"/>
+        <w:pStyle w:val="ListParagraph"/>
         <w:numPr>
           <w:ilvl w:val="0"/>
           <w:numId w:val="2"/>
@@ -3011,7 +2960,7 @@
     </w:p>
     <w:p>
       <w:pPr>
-        <w:pStyle w:val="Prrafodelista"/>
+        <w:pStyle w:val="ListParagraph"/>
         <w:numPr>
           <w:ilvl w:val="0"/>
           <w:numId w:val="2"/>
@@ -3024,7 +2973,7 @@
     </w:p>
     <w:p>
       <w:pPr>
-        <w:pStyle w:val="Prrafodelista"/>
+        <w:pStyle w:val="ListParagraph"/>
         <w:numPr>
           <w:ilvl w:val="0"/>
           <w:numId w:val="2"/>
@@ -3037,20 +2986,7 @@
     </w:p>
     <w:p>
       <w:pPr>
-        <w:pStyle w:val="Prrafodelista"/>
-        <w:numPr>
-          <w:ilvl w:val="0"/>
-          <w:numId w:val="2"/>
-        </w:numPr>
-        <w:spacing w:after="60"/>
-      </w:pPr>
-      <w:r>
-        <w:t>[COMPLETAR]</w:t>
-      </w:r>
-    </w:p>
-    <w:p>
-      <w:pPr>
-        <w:pStyle w:val="Ttulo2"/>
+        <w:pStyle w:val="Heading2"/>
         <w:spacing w:before="240" w:after="120"/>
       </w:pPr>
       <w:bookmarkStart w:id="6" w:name="_Toc240358105"/>
@@ -3094,7 +3030,7 @@
     </w:p>
     <w:p>
       <w:pPr>
-        <w:pStyle w:val="Ttulo1"/>
+        <w:pStyle w:val="Heading1"/>
         <w:pBdr>
           <w:bottom w:val="single" w:sz="6" w:space="0" w:color="1F3864"/>
         </w:pBdr>
@@ -3115,7 +3051,7 @@
     </w:p>
     <w:p>
       <w:pPr>
-        <w:pStyle w:val="Ttulo2"/>
+        <w:pStyle w:val="Heading2"/>
         <w:spacing w:before="240" w:after="120"/>
       </w:pPr>
       <w:bookmarkStart w:id="8" w:name="_Toc240358107"/>
@@ -3141,7 +3077,7 @@
     </w:p>
     <w:p>
       <w:pPr>
-        <w:pStyle w:val="Ttulo2"/>
+        <w:pStyle w:val="Heading2"/>
         <w:spacing w:before="240" w:after="120"/>
       </w:pPr>
       <w:bookmarkStart w:id="9" w:name="_Toc240358108"/>
@@ -3174,7 +3110,7 @@
     </w:p>
     <w:p>
       <w:pPr>
-        <w:pStyle w:val="Prrafodelista"/>
+        <w:pStyle w:val="ListParagraph"/>
         <w:numPr>
           <w:ilvl w:val="0"/>
           <w:numId w:val="2"/>
@@ -3188,13 +3124,7 @@
         <w:rPr>
           <w:highlight w:val="yellow"/>
         </w:rPr>
-        <w:t>.</w:t>
-      </w:r>
-      <w:r>
-        <w:rPr>
-          <w:highlight w:val="yellow"/>
-        </w:rPr>
-        <w:t xml:space="preserve"> (</w:t>
+        <w:t>. (</w:t>
       </w:r>
       <w:r>
         <w:rPr>
@@ -3211,7 +3141,7 @@
     </w:p>
     <w:p>
       <w:pPr>
-        <w:pStyle w:val="Prrafodelista"/>
+        <w:pStyle w:val="ListParagraph"/>
         <w:numPr>
           <w:ilvl w:val="0"/>
           <w:numId w:val="2"/>
@@ -3224,7 +3154,7 @@
     </w:p>
     <w:p>
       <w:pPr>
-        <w:pStyle w:val="Prrafodelista"/>
+        <w:pStyle w:val="ListParagraph"/>
         <w:numPr>
           <w:ilvl w:val="0"/>
           <w:numId w:val="2"/>
@@ -3237,7 +3167,7 @@
     </w:p>
     <w:p>
       <w:pPr>
-        <w:pStyle w:val="Prrafodelista"/>
+        <w:pStyle w:val="ListParagraph"/>
         <w:numPr>
           <w:ilvl w:val="0"/>
           <w:numId w:val="2"/>
@@ -3262,7 +3192,7 @@
     </w:p>
     <w:p>
       <w:pPr>
-        <w:pStyle w:val="Prrafodelista"/>
+        <w:pStyle w:val="ListParagraph"/>
         <w:numPr>
           <w:ilvl w:val="0"/>
           <w:numId w:val="2"/>
@@ -3270,18 +3200,12 @@
         <w:spacing w:after="60"/>
       </w:pPr>
       <w:r>
-        <w:t xml:space="preserve">Conservar la fecha original de cada </w:t>
-      </w:r>
-      <w:r>
-        <w:t>documento,</w:t>
-      </w:r>
-      <w:r>
-        <w:t xml:space="preserve"> aunque el expediente se actualice después.</w:t>
-      </w:r>
-    </w:p>
-    <w:p>
-      <w:pPr>
-        <w:pStyle w:val="Prrafodelista"/>
+        <w:t>Conservar la fecha original de cada documento, aunque el expediente se actualice después.</w:t>
+      </w:r>
+    </w:p>
+    <w:p>
+      <w:pPr>
+        <w:pStyle w:val="ListParagraph"/>
         <w:numPr>
           <w:ilvl w:val="0"/>
           <w:numId w:val="2"/>
@@ -3294,7 +3218,7 @@
     </w:p>
     <w:p>
       <w:pPr>
-        <w:pStyle w:val="Prrafodelista"/>
+        <w:pStyle w:val="ListParagraph"/>
         <w:numPr>
           <w:ilvl w:val="0"/>
           <w:numId w:val="2"/>
@@ -3307,7 +3231,7 @@
     </w:p>
     <w:p>
       <w:pPr>
-        <w:pStyle w:val="Prrafodelista"/>
+        <w:pStyle w:val="ListParagraph"/>
         <w:numPr>
           <w:ilvl w:val="0"/>
           <w:numId w:val="2"/>
@@ -3324,12 +3248,12 @@
         <w:rPr>
           <w:highlight w:val="yellow"/>
         </w:rPr>
-        <w:t>(PREGUNTAR SI ES NECESARIO O SI SE QUIIERE)</w:t>
-      </w:r>
-    </w:p>
-    <w:p>
-      <w:pPr>
-        <w:pStyle w:val="Ttulo2"/>
+        <w:t>(PREGUNTAR SI ES NECESARIO O SI SE QUIERE)</w:t>
+      </w:r>
+    </w:p>
+    <w:p>
+      <w:pPr>
+        <w:pStyle w:val="Heading2"/>
         <w:spacing w:before="240" w:after="120"/>
       </w:pPr>
       <w:bookmarkStart w:id="10" w:name="_Toc240358109"/>
@@ -3383,12 +3307,6 @@
         <w:gridCol w:w="3240"/>
       </w:tblGrid>
       <w:tr>
-        <w:tblPrEx>
-          <w:tblCellMar>
-            <w:top w:w="0" w:type="dxa"/>
-            <w:bottom w:w="0" w:type="dxa"/>
-          </w:tblCellMar>
-        </w:tblPrEx>
         <w:trPr>
           <w:tblHeader/>
         </w:trPr>
@@ -3413,7 +3331,6 @@
                 <w:sz w:val="19"/>
                 <w:szCs w:val="19"/>
               </w:rPr>
-              <w:lastRenderedPageBreak/>
               <w:t>Tipo de usuario</w:t>
             </w:r>
           </w:p>
@@ -3470,12 +3387,6 @@
         </w:tc>
       </w:tr>
       <w:tr>
-        <w:tblPrEx>
-          <w:tblCellMar>
-            <w:top w:w="0" w:type="dxa"/>
-            <w:bottom w:w="0" w:type="dxa"/>
-          </w:tblCellMar>
-        </w:tblPrEx>
         <w:tc>
           <w:tcPr>
             <w:tcW w:w="2400" w:type="dxa"/>
@@ -3514,7 +3425,15 @@
                 <w:sz w:val="19"/>
                 <w:szCs w:val="19"/>
               </w:rPr>
-              <w:t>Responsable de la administración operativa del Acueducto, con 4 años en el puesto. Maneja actualmente el sistema móvil de facturación (SADA), por lo que tiene familiaridad con herramientas digitales. Sería la usuaria principal de SIGEDA: registra, actualiza y consulta los expedientes.</w:t>
+              <w:t xml:space="preserve">Responsable de la administración operativa del Acueducto, con 4 años en el puesto. Maneja actualmente el sistema móvil de facturación (SADA), por lo que tiene </w:t>
+            </w:r>
+            <w:r>
+              <w:rPr>
+                <w:sz w:val="19"/>
+                <w:szCs w:val="19"/>
+              </w:rPr>
+              <w:lastRenderedPageBreak/>
+              <w:t>familiaridad con herramientas digitales. Sería la usuaria principal de SIGEDA: registra, actualiza y consulta los expedientes.</w:t>
             </w:r>
           </w:p>
         </w:tc>
@@ -3535,18 +3454,13 @@
                 <w:sz w:val="19"/>
                 <w:szCs w:val="19"/>
               </w:rPr>
+              <w:lastRenderedPageBreak/>
               <w:t>Medio — cómoda con aplicaciones móviles y de gestión, aunque no es personal técnico.</w:t>
             </w:r>
           </w:p>
         </w:tc>
       </w:tr>
       <w:tr>
-        <w:tblPrEx>
-          <w:tblCellMar>
-            <w:top w:w="0" w:type="dxa"/>
-            <w:bottom w:w="0" w:type="dxa"/>
-          </w:tblCellMar>
-        </w:tblPrEx>
         <w:tc>
           <w:tcPr>
             <w:tcW w:w="2400" w:type="dxa"/>
@@ -3624,12 +3538,6 @@
         </w:tc>
       </w:tr>
       <w:tr>
-        <w:tblPrEx>
-          <w:tblCellMar>
-            <w:top w:w="0" w:type="dxa"/>
-            <w:bottom w:w="0" w:type="dxa"/>
-          </w:tblCellMar>
-        </w:tblPrEx>
         <w:tc>
           <w:tcPr>
             <w:tcW w:w="2400" w:type="dxa"/>
@@ -3697,7 +3605,7 @@
     </w:tbl>
     <w:p>
       <w:pPr>
-        <w:pStyle w:val="Ttulo2"/>
+        <w:pStyle w:val="Heading2"/>
         <w:spacing w:before="240" w:after="120"/>
       </w:pPr>
       <w:bookmarkStart w:id="11" w:name="_Toc240358110"/>
@@ -3725,12 +3633,34 @@
           <w:sz w:val="20"/>
           <w:szCs w:val="20"/>
         </w:rPr>
-        <w:t>Limitaciones que el equipo debe respetar: presupuesto, plazos del curso, tecnología obligatoria, conectividad limitada en la zona, políticas internas de la ASADA, normativa de AyA, etc.</w:t>
-      </w:r>
-    </w:p>
-    <w:p>
-      <w:pPr>
-        <w:pStyle w:val="Prrafodelista"/>
+        <w:t xml:space="preserve">Limitaciones que el equipo debe respetar: presupuesto, plazos del curso, tecnología obligatoria, conectividad limitada en la zona, políticas internas de la ASADA, normativa de </w:t>
+      </w:r>
+      <w:proofErr w:type="spellStart"/>
+      <w:r>
+        <w:rPr>
+          <w:i/>
+          <w:iCs/>
+          <w:color w:val="595959"/>
+          <w:sz w:val="20"/>
+          <w:szCs w:val="20"/>
+        </w:rPr>
+        <w:t>AyA</w:t>
+      </w:r>
+      <w:proofErr w:type="spellEnd"/>
+      <w:r>
+        <w:rPr>
+          <w:i/>
+          <w:iCs/>
+          <w:color w:val="595959"/>
+          <w:sz w:val="20"/>
+          <w:szCs w:val="20"/>
+        </w:rPr>
+        <w:t>, etc.</w:t>
+      </w:r>
+    </w:p>
+    <w:p>
+      <w:pPr>
+        <w:pStyle w:val="ListParagraph"/>
         <w:numPr>
           <w:ilvl w:val="0"/>
           <w:numId w:val="2"/>
@@ -3738,15 +3668,12 @@
         <w:spacing w:after="60"/>
       </w:pPr>
       <w:r>
-        <w:t>El proyecto es de análisis y diseño: en este curso no se entrega una implementación funcional completa del sistema.</w:t>
-      </w:r>
-      <w:r>
-        <w:t xml:space="preserve"> </w:t>
-      </w:r>
-    </w:p>
-    <w:p>
-      <w:pPr>
-        <w:pStyle w:val="Prrafodelista"/>
+        <w:t xml:space="preserve">El proyecto es de análisis y diseño: en este curso no se entrega una implementación funcional completa del sistema. </w:t>
+      </w:r>
+    </w:p>
+    <w:p>
+      <w:pPr>
+        <w:pStyle w:val="ListParagraph"/>
         <w:numPr>
           <w:ilvl w:val="0"/>
           <w:numId w:val="2"/>
@@ -3754,15 +3681,12 @@
         <w:spacing w:after="60"/>
       </w:pPr>
       <w:r>
-        <w:t>El plazo del proyecto está limitado al calendario del semestre (II Ciclo 2026).</w:t>
-      </w:r>
-      <w:r>
-        <w:t xml:space="preserve"> </w:t>
-      </w:r>
-    </w:p>
-    <w:p>
-      <w:pPr>
-        <w:pStyle w:val="Prrafodelista"/>
+        <w:t xml:space="preserve">El plazo del proyecto está limitado al calendario del semestre (II Ciclo 2026). </w:t>
+      </w:r>
+    </w:p>
+    <w:p>
+      <w:pPr>
+        <w:pStyle w:val="ListParagraph"/>
         <w:numPr>
           <w:ilvl w:val="0"/>
           <w:numId w:val="2"/>
@@ -3770,21 +3694,12 @@
         <w:spacing w:after="60"/>
       </w:pPr>
       <w:r>
-        <w:t>El sistema se desplegará en un entorno de oficina con una sola computadora portátil operativa y una infraestructura de conectividad a Internet</w:t>
-      </w:r>
-      <w:r>
-        <w:t xml:space="preserve"> </w:t>
-      </w:r>
-      <w:r>
-        <w:t>estable</w:t>
-      </w:r>
-      <w:r>
-        <w:t>.</w:t>
-      </w:r>
-    </w:p>
-    <w:p>
-      <w:pPr>
-        <w:pStyle w:val="Prrafodelista"/>
+        <w:t>El sistema se desplegará en un entorno de oficina con una sola computadora portátil operativa y una infraestructura de conectividad a Internet.</w:t>
+      </w:r>
+    </w:p>
+    <w:p>
+      <w:pPr>
+        <w:pStyle w:val="ListParagraph"/>
         <w:numPr>
           <w:ilvl w:val="0"/>
           <w:numId w:val="2"/>
@@ -3797,7 +3712,7 @@
     </w:p>
     <w:p>
       <w:pPr>
-        <w:pStyle w:val="Prrafodelista"/>
+        <w:pStyle w:val="ListParagraph"/>
         <w:numPr>
           <w:ilvl w:val="0"/>
           <w:numId w:val="2"/>
@@ -3821,7 +3736,7 @@
     </w:p>
     <w:p>
       <w:pPr>
-        <w:pStyle w:val="Ttulo2"/>
+        <w:pStyle w:val="Heading2"/>
         <w:spacing w:before="240" w:after="120"/>
       </w:pPr>
       <w:bookmarkStart w:id="12" w:name="_Toc240358111"/>
@@ -3854,7 +3769,7 @@
     </w:p>
     <w:p>
       <w:pPr>
-        <w:pStyle w:val="Prrafodelista"/>
+        <w:pStyle w:val="ListParagraph"/>
         <w:numPr>
           <w:ilvl w:val="0"/>
           <w:numId w:val="2"/>
@@ -3867,7 +3782,7 @@
     </w:p>
     <w:p>
       <w:pPr>
-        <w:pStyle w:val="Prrafodelista"/>
+        <w:pStyle w:val="ListParagraph"/>
         <w:numPr>
           <w:ilvl w:val="0"/>
           <w:numId w:val="2"/>
@@ -3880,7 +3795,7 @@
     </w:p>
     <w:p>
       <w:pPr>
-        <w:pStyle w:val="Prrafodelista"/>
+        <w:pStyle w:val="ListParagraph"/>
         <w:numPr>
           <w:ilvl w:val="0"/>
           <w:numId w:val="2"/>
@@ -3902,7 +3817,7 @@
     </w:p>
     <w:p>
       <w:pPr>
-        <w:pStyle w:val="Prrafodelista"/>
+        <w:pStyle w:val="ListParagraph"/>
         <w:numPr>
           <w:ilvl w:val="0"/>
           <w:numId w:val="2"/>
@@ -3918,7 +3833,7 @@
     </w:p>
     <w:p>
       <w:pPr>
-        <w:pStyle w:val="Ttulo1"/>
+        <w:pStyle w:val="Heading1"/>
         <w:pBdr>
           <w:bottom w:val="single" w:sz="6" w:space="0" w:color="1F3864"/>
         </w:pBdr>
@@ -3956,7 +3871,29 @@
           <w:sz w:val="20"/>
           <w:szCs w:val="20"/>
         </w:rPr>
-        <w:t>Esta es la sección más importante del documento. Cada requerimiento debe cumplir las características vistas en clase: correcto, no ambiguo, completo, consistente, verificable, factible, trazable y priorizado (ver checklist en la sección 6).</w:t>
+        <w:t xml:space="preserve">Esta es la sección más importante del documento. Cada requerimiento debe cumplir las características vistas en clase: correcto, no ambiguo, completo, consistente, verificable, factible, trazable y priorizado (ver </w:t>
+      </w:r>
+      <w:proofErr w:type="spellStart"/>
+      <w:r>
+        <w:rPr>
+          <w:i/>
+          <w:iCs/>
+          <w:color w:val="595959"/>
+          <w:sz w:val="20"/>
+          <w:szCs w:val="20"/>
+        </w:rPr>
+        <w:t>checklist</w:t>
+      </w:r>
+      <w:proofErr w:type="spellEnd"/>
+      <w:r>
+        <w:rPr>
+          <w:i/>
+          <w:iCs/>
+          <w:color w:val="595959"/>
+          <w:sz w:val="20"/>
+          <w:szCs w:val="20"/>
+        </w:rPr>
+        <w:t xml:space="preserve"> en la sección 6).</w:t>
       </w:r>
     </w:p>
     <w:p>
@@ -3966,7 +3903,7 @@
     </w:p>
     <w:p>
       <w:pPr>
-        <w:pStyle w:val="Ttulo2"/>
+        <w:pStyle w:val="Heading2"/>
         <w:spacing w:before="240" w:after="120"/>
       </w:pPr>
       <w:bookmarkStart w:id="14" w:name="_Toc240358113"/>
@@ -4023,12 +3960,6 @@
         <w:gridCol w:w="1700"/>
       </w:tblGrid>
       <w:tr>
-        <w:tblPrEx>
-          <w:tblCellMar>
-            <w:top w:w="0" w:type="dxa"/>
-            <w:bottom w:w="0" w:type="dxa"/>
-          </w:tblCellMar>
-        </w:tblPrEx>
         <w:trPr>
           <w:tblHeader/>
         </w:trPr>
@@ -4185,12 +4116,6 @@
         </w:tc>
       </w:tr>
       <w:tr>
-        <w:tblPrEx>
-          <w:tblCellMar>
-            <w:top w:w="0" w:type="dxa"/>
-            <w:bottom w:w="0" w:type="dxa"/>
-          </w:tblCellMar>
-        </w:tblPrEx>
         <w:tc>
           <w:tcPr>
             <w:tcW w:w="800" w:type="dxa"/>
@@ -4359,7 +4284,7 @@
           </w:tcPr>
           <w:p>
             <w:pPr>
-              <w:pStyle w:val="Prrafodelista"/>
+              <w:pStyle w:val="ListParagraph"/>
               <w:numPr>
                 <w:ilvl w:val="0"/>
                 <w:numId w:val="3"/>
@@ -4369,12 +4294,6 @@
         </w:tc>
       </w:tr>
       <w:tr>
-        <w:tblPrEx>
-          <w:tblCellMar>
-            <w:top w:w="0" w:type="dxa"/>
-            <w:bottom w:w="0" w:type="dxa"/>
-          </w:tblCellMar>
-        </w:tblPrEx>
         <w:tc>
           <w:tcPr>
             <w:tcW w:w="800" w:type="dxa"/>
@@ -4505,12 +4424,6 @@
         </w:tc>
       </w:tr>
       <w:tr>
-        <w:tblPrEx>
-          <w:tblCellMar>
-            <w:top w:w="0" w:type="dxa"/>
-            <w:bottom w:w="0" w:type="dxa"/>
-          </w:tblCellMar>
-        </w:tblPrEx>
         <w:tc>
           <w:tcPr>
             <w:tcW w:w="800" w:type="dxa"/>
@@ -4674,12 +4587,6 @@
         </w:tc>
       </w:tr>
       <w:tr>
-        <w:tblPrEx>
-          <w:tblCellMar>
-            <w:top w:w="0" w:type="dxa"/>
-            <w:bottom w:w="0" w:type="dxa"/>
-          </w:tblCellMar>
-        </w:tblPrEx>
         <w:tc>
           <w:tcPr>
             <w:tcW w:w="800" w:type="dxa"/>
@@ -4743,15 +4650,7 @@
                 <w:szCs w:val="19"/>
                 <w:highlight w:val="yellow"/>
               </w:rPr>
-              <w:t>El sistema debe indicar visualmente si el expediente de un abonado está completo o incompleto.</w:t>
-            </w:r>
-            <w:r>
-              <w:rPr>
-                <w:sz w:val="19"/>
-                <w:szCs w:val="19"/>
-                <w:highlight w:val="yellow"/>
-              </w:rPr>
-              <w:t xml:space="preserve"> (OPCIONAL, TENTATIVO, CONSULTAR)</w:t>
+              <w:t>El sistema debe indicar visualmente si el expediente de un abonado está completo o incompleto. (OPCIONAL, TENTATIVO, CONSULTAR)</w:t>
             </w:r>
           </w:p>
         </w:tc>
@@ -4819,12 +4718,6 @@
         </w:tc>
       </w:tr>
       <w:tr>
-        <w:tblPrEx>
-          <w:tblCellMar>
-            <w:top w:w="0" w:type="dxa"/>
-            <w:bottom w:w="0" w:type="dxa"/>
-          </w:tblCellMar>
-        </w:tblPrEx>
         <w:tc>
           <w:tcPr>
             <w:tcW w:w="800" w:type="dxa"/>
@@ -4987,12 +4880,6 @@
         </w:tc>
       </w:tr>
       <w:tr>
-        <w:tblPrEx>
-          <w:tblCellMar>
-            <w:top w:w="0" w:type="dxa"/>
-            <w:bottom w:w="0" w:type="dxa"/>
-          </w:tblCellMar>
-        </w:tblPrEx>
         <w:tc>
           <w:tcPr>
             <w:tcW w:w="800" w:type="dxa"/>
@@ -5157,12 +5044,6 @@
         </w:tc>
       </w:tr>
       <w:tr>
-        <w:tblPrEx>
-          <w:tblCellMar>
-            <w:top w:w="0" w:type="dxa"/>
-            <w:bottom w:w="0" w:type="dxa"/>
-          </w:tblCellMar>
-        </w:tblPrEx>
         <w:tc>
           <w:tcPr>
             <w:tcW w:w="800" w:type="dxa"/>
@@ -5335,12 +5216,6 @@
         </w:tc>
       </w:tr>
       <w:tr>
-        <w:tblPrEx>
-          <w:tblCellMar>
-            <w:top w:w="0" w:type="dxa"/>
-            <w:bottom w:w="0" w:type="dxa"/>
-          </w:tblCellMar>
-        </w:tblPrEx>
         <w:tc>
           <w:tcPr>
             <w:tcW w:w="800" w:type="dxa"/>
@@ -5527,12 +5402,6 @@
         </w:tc>
       </w:tr>
       <w:tr>
-        <w:tblPrEx>
-          <w:tblCellMar>
-            <w:top w:w="0" w:type="dxa"/>
-            <w:bottom w:w="0" w:type="dxa"/>
-          </w:tblCellMar>
-        </w:tblPrEx>
         <w:tc>
           <w:tcPr>
             <w:tcW w:w="800" w:type="dxa"/>
@@ -5657,7 +5526,7 @@
     </w:tbl>
     <w:p>
       <w:pPr>
-        <w:pStyle w:val="Ttulo2"/>
+        <w:pStyle w:val="Heading2"/>
         <w:spacing w:before="240" w:after="120"/>
       </w:pPr>
       <w:bookmarkStart w:id="15" w:name="_Toc240358114"/>
@@ -5726,12 +5595,6 @@
         <w:gridCol w:w="3240"/>
       </w:tblGrid>
       <w:tr>
-        <w:tblPrEx>
-          <w:tblCellMar>
-            <w:top w:w="0" w:type="dxa"/>
-            <w:bottom w:w="0" w:type="dxa"/>
-          </w:tblCellMar>
-        </w:tblPrEx>
         <w:trPr>
           <w:tblHeader/>
         </w:trPr>
@@ -5812,12 +5675,6 @@
         </w:tc>
       </w:tr>
       <w:tr>
-        <w:tblPrEx>
-          <w:tblCellMar>
-            <w:top w:w="0" w:type="dxa"/>
-            <w:bottom w:w="0" w:type="dxa"/>
-          </w:tblCellMar>
-        </w:tblPrEx>
         <w:tc>
           <w:tcPr>
             <w:tcW w:w="1200" w:type="dxa"/>
@@ -5922,12 +5779,6 @@
         <w:gridCol w:w="3240"/>
       </w:tblGrid>
       <w:tr>
-        <w:tblPrEx>
-          <w:tblCellMar>
-            <w:top w:w="0" w:type="dxa"/>
-            <w:bottom w:w="0" w:type="dxa"/>
-          </w:tblCellMar>
-        </w:tblPrEx>
         <w:trPr>
           <w:tblHeader/>
         </w:trPr>
@@ -6008,12 +5859,6 @@
         </w:tc>
       </w:tr>
       <w:tr>
-        <w:tblPrEx>
-          <w:tblCellMar>
-            <w:top w:w="0" w:type="dxa"/>
-            <w:bottom w:w="0" w:type="dxa"/>
-          </w:tblCellMar>
-        </w:tblPrEx>
         <w:tc>
           <w:tcPr>
             <w:tcW w:w="1200" w:type="dxa"/>
@@ -6117,12 +5962,6 @@
         <w:gridCol w:w="3240"/>
       </w:tblGrid>
       <w:tr>
-        <w:tblPrEx>
-          <w:tblCellMar>
-            <w:top w:w="0" w:type="dxa"/>
-            <w:bottom w:w="0" w:type="dxa"/>
-          </w:tblCellMar>
-        </w:tblPrEx>
         <w:trPr>
           <w:tblHeader/>
         </w:trPr>
@@ -6203,12 +6042,6 @@
         </w:tc>
       </w:tr>
       <w:tr>
-        <w:tblPrEx>
-          <w:tblCellMar>
-            <w:top w:w="0" w:type="dxa"/>
-            <w:bottom w:w="0" w:type="dxa"/>
-          </w:tblCellMar>
-        </w:tblPrEx>
         <w:tc>
           <w:tcPr>
             <w:tcW w:w="1200" w:type="dxa"/>
@@ -6312,12 +6145,6 @@
         <w:gridCol w:w="3240"/>
       </w:tblGrid>
       <w:tr>
-        <w:tblPrEx>
-          <w:tblCellMar>
-            <w:top w:w="0" w:type="dxa"/>
-            <w:bottom w:w="0" w:type="dxa"/>
-          </w:tblCellMar>
-        </w:tblPrEx>
         <w:trPr>
           <w:tblHeader/>
         </w:trPr>
@@ -6398,12 +6225,6 @@
         </w:tc>
       </w:tr>
       <w:tr>
-        <w:tblPrEx>
-          <w:tblCellMar>
-            <w:top w:w="0" w:type="dxa"/>
-            <w:bottom w:w="0" w:type="dxa"/>
-          </w:tblCellMar>
-        </w:tblPrEx>
         <w:tc>
           <w:tcPr>
             <w:tcW w:w="1200" w:type="dxa"/>
@@ -6521,12 +6342,6 @@
         <w:gridCol w:w="3240"/>
       </w:tblGrid>
       <w:tr>
-        <w:tblPrEx>
-          <w:tblCellMar>
-            <w:top w:w="0" w:type="dxa"/>
-            <w:bottom w:w="0" w:type="dxa"/>
-          </w:tblCellMar>
-        </w:tblPrEx>
         <w:trPr>
           <w:tblHeader/>
         </w:trPr>
@@ -6607,12 +6422,6 @@
         </w:tc>
       </w:tr>
       <w:tr>
-        <w:tblPrEx>
-          <w:tblCellMar>
-            <w:top w:w="0" w:type="dxa"/>
-            <w:bottom w:w="0" w:type="dxa"/>
-          </w:tblCellMar>
-        </w:tblPrEx>
         <w:trPr>
           <w:trHeight w:val="990"/>
         </w:trPr>
@@ -6705,7 +6514,7 @@
     </w:tbl>
     <w:p>
       <w:pPr>
-        <w:pStyle w:val="Ttulo2"/>
+        <w:pStyle w:val="Heading2"/>
         <w:spacing w:before="240" w:after="120"/>
       </w:pPr>
       <w:bookmarkStart w:id="16" w:name="_Toc240358115"/>
@@ -6761,12 +6570,6 @@
         <w:gridCol w:w="1740"/>
       </w:tblGrid>
       <w:tr>
-        <w:tblPrEx>
-          <w:tblCellMar>
-            <w:top w:w="0" w:type="dxa"/>
-            <w:bottom w:w="0" w:type="dxa"/>
-          </w:tblCellMar>
-        </w:tblPrEx>
         <w:trPr>
           <w:tblHeader/>
         </w:trPr>
@@ -6872,12 +6675,6 @@
         </w:tc>
       </w:tr>
       <w:tr>
-        <w:tblPrEx>
-          <w:tblCellMar>
-            <w:top w:w="0" w:type="dxa"/>
-            <w:bottom w:w="0" w:type="dxa"/>
-          </w:tblCellMar>
-        </w:tblPrEx>
         <w:tc>
           <w:tcPr>
             <w:tcW w:w="900" w:type="dxa"/>
@@ -6964,12 +6761,6 @@
         </w:tc>
       </w:tr>
       <w:tr>
-        <w:tblPrEx>
-          <w:tblCellMar>
-            <w:top w:w="0" w:type="dxa"/>
-            <w:bottom w:w="0" w:type="dxa"/>
-          </w:tblCellMar>
-        </w:tblPrEx>
         <w:tc>
           <w:tcPr>
             <w:tcW w:w="900" w:type="dxa"/>
@@ -7062,7 +6853,7 @@
     </w:tbl>
     <w:p>
       <w:pPr>
-        <w:pStyle w:val="Ttulo2"/>
+        <w:pStyle w:val="Heading2"/>
         <w:spacing w:before="240" w:after="120"/>
       </w:pPr>
       <w:bookmarkStart w:id="17" w:name="_Toc240358116"/>
@@ -7187,7 +6978,7 @@
     </w:p>
     <w:p>
       <w:pPr>
-        <w:pStyle w:val="Ttulo1"/>
+        <w:pStyle w:val="Heading1"/>
         <w:pBdr>
           <w:bottom w:val="single" w:sz="6" w:space="0" w:color="1F3864"/>
         </w:pBdr>
@@ -7223,7 +7014,7 @@
     </w:p>
     <w:p>
       <w:pPr>
-        <w:pStyle w:val="Ttulo2"/>
+        <w:pStyle w:val="Heading2"/>
         <w:spacing w:before="240" w:after="120"/>
       </w:pPr>
       <w:bookmarkStart w:id="19" w:name="_Toc240358118"/>
@@ -7261,12 +7052,6 @@
         <w:gridCol w:w="6940"/>
       </w:tblGrid>
       <w:tr>
-        <w:tblPrEx>
-          <w:tblCellMar>
-            <w:top w:w="0" w:type="dxa"/>
-            <w:bottom w:w="0" w:type="dxa"/>
-          </w:tblCellMar>
-        </w:tblPrEx>
         <w:trPr>
           <w:tblHeader/>
         </w:trPr>
@@ -7322,12 +7107,6 @@
         </w:tc>
       </w:tr>
       <w:tr>
-        <w:tblPrEx>
-          <w:tblCellMar>
-            <w:top w:w="0" w:type="dxa"/>
-            <w:bottom w:w="0" w:type="dxa"/>
-          </w:tblCellMar>
-        </w:tblPrEx>
         <w:tc>
           <w:tcPr>
             <w:tcW w:w="2400" w:type="dxa"/>
@@ -7372,12 +7151,6 @@
         </w:tc>
       </w:tr>
       <w:tr>
-        <w:tblPrEx>
-          <w:tblCellMar>
-            <w:top w:w="0" w:type="dxa"/>
-            <w:bottom w:w="0" w:type="dxa"/>
-          </w:tblCellMar>
-        </w:tblPrEx>
         <w:tc>
           <w:tcPr>
             <w:tcW w:w="2400" w:type="dxa"/>
@@ -7424,12 +7197,6 @@
         </w:tc>
       </w:tr>
       <w:tr>
-        <w:tblPrEx>
-          <w:tblCellMar>
-            <w:top w:w="0" w:type="dxa"/>
-            <w:bottom w:w="0" w:type="dxa"/>
-          </w:tblCellMar>
-        </w:tblPrEx>
         <w:tc>
           <w:tcPr>
             <w:tcW w:w="2400" w:type="dxa"/>
@@ -7476,7 +7243,7 @@
     </w:tbl>
     <w:p>
       <w:pPr>
-        <w:pStyle w:val="Ttulo2"/>
+        <w:pStyle w:val="Heading2"/>
         <w:spacing w:before="240" w:after="120"/>
       </w:pPr>
       <w:bookmarkStart w:id="20" w:name="_Toc240358119"/>
@@ -7517,12 +7284,6 @@
         <w:gridCol w:w="1340"/>
       </w:tblGrid>
       <w:tr>
-        <w:tblPrEx>
-          <w:tblCellMar>
-            <w:top w:w="0" w:type="dxa"/>
-            <w:bottom w:w="0" w:type="dxa"/>
-          </w:tblCellMar>
-        </w:tblPrEx>
         <w:trPr>
           <w:tblHeader/>
         </w:trPr>
@@ -7653,12 +7414,6 @@
         </w:tc>
       </w:tr>
       <w:tr>
-        <w:tblPrEx>
-          <w:tblCellMar>
-            <w:top w:w="0" w:type="dxa"/>
-            <w:bottom w:w="0" w:type="dxa"/>
-          </w:tblCellMar>
-        </w:tblPrEx>
         <w:tc>
           <w:tcPr>
             <w:tcW w:w="900" w:type="dxa"/>
@@ -7766,12 +7521,6 @@
         </w:tc>
       </w:tr>
       <w:tr>
-        <w:tblPrEx>
-          <w:tblCellMar>
-            <w:top w:w="0" w:type="dxa"/>
-            <w:bottom w:w="0" w:type="dxa"/>
-          </w:tblCellMar>
-        </w:tblPrEx>
         <w:tc>
           <w:tcPr>
             <w:tcW w:w="900" w:type="dxa"/>
@@ -7884,12 +7633,6 @@
         </w:tc>
       </w:tr>
       <w:tr>
-        <w:tblPrEx>
-          <w:tblCellMar>
-            <w:top w:w="0" w:type="dxa"/>
-            <w:bottom w:w="0" w:type="dxa"/>
-          </w:tblCellMar>
-        </w:tblPrEx>
         <w:tc>
           <w:tcPr>
             <w:tcW w:w="900" w:type="dxa"/>
@@ -7997,12 +7740,6 @@
         </w:tc>
       </w:tr>
       <w:tr>
-        <w:tblPrEx>
-          <w:tblCellMar>
-            <w:top w:w="0" w:type="dxa"/>
-            <w:bottom w:w="0" w:type="dxa"/>
-          </w:tblCellMar>
-        </w:tblPrEx>
         <w:tc>
           <w:tcPr>
             <w:tcW w:w="900" w:type="dxa"/>
@@ -8117,7 +7854,7 @@
     </w:tbl>
     <w:p>
       <w:pPr>
-        <w:pStyle w:val="Ttulo1"/>
+        <w:pStyle w:val="Heading1"/>
         <w:pBdr>
           <w:bottom w:val="single" w:sz="6" w:space="0" w:color="1F3864"/>
         </w:pBdr>
@@ -8176,12 +7913,6 @@
         <w:gridCol w:w="2040"/>
       </w:tblGrid>
       <w:tr>
-        <w:tblPrEx>
-          <w:tblCellMar>
-            <w:top w:w="0" w:type="dxa"/>
-            <w:bottom w:w="0" w:type="dxa"/>
-          </w:tblCellMar>
-        </w:tblPrEx>
         <w:trPr>
           <w:tblHeader/>
         </w:trPr>
@@ -8287,12 +8018,6 @@
         </w:tc>
       </w:tr>
       <w:tr>
-        <w:tblPrEx>
-          <w:tblCellMar>
-            <w:top w:w="0" w:type="dxa"/>
-            <w:bottom w:w="0" w:type="dxa"/>
-          </w:tblCellMar>
-        </w:tblPrEx>
         <w:tc>
           <w:tcPr>
             <w:tcW w:w="1400" w:type="dxa"/>
@@ -8379,12 +8104,6 @@
         </w:tc>
       </w:tr>
       <w:tr>
-        <w:tblPrEx>
-          <w:tblCellMar>
-            <w:top w:w="0" w:type="dxa"/>
-            <w:bottom w:w="0" w:type="dxa"/>
-          </w:tblCellMar>
-        </w:tblPrEx>
         <w:tc>
           <w:tcPr>
             <w:tcW w:w="1400" w:type="dxa"/>
@@ -8475,12 +8194,6 @@
         </w:tc>
       </w:tr>
       <w:tr>
-        <w:tblPrEx>
-          <w:tblCellMar>
-            <w:top w:w="0" w:type="dxa"/>
-            <w:bottom w:w="0" w:type="dxa"/>
-          </w:tblCellMar>
-        </w:tblPrEx>
         <w:tc>
           <w:tcPr>
             <w:tcW w:w="1400" w:type="dxa"/>
@@ -8569,7 +8282,7 @@
     </w:tbl>
     <w:p>
       <w:pPr>
-        <w:pStyle w:val="Ttulo1"/>
+        <w:pStyle w:val="Heading1"/>
         <w:pBdr>
           <w:bottom w:val="single" w:sz="6" w:space="0" w:color="1F3864"/>
         </w:pBdr>
@@ -8625,12 +8338,6 @@
         <w:gridCol w:w="6840"/>
       </w:tblGrid>
       <w:tr>
-        <w:tblPrEx>
-          <w:tblCellMar>
-            <w:top w:w="0" w:type="dxa"/>
-            <w:bottom w:w="0" w:type="dxa"/>
-          </w:tblCellMar>
-        </w:tblPrEx>
         <w:trPr>
           <w:tblHeader/>
         </w:trPr>
@@ -8686,12 +8393,6 @@
         </w:tc>
       </w:tr>
       <w:tr>
-        <w:tblPrEx>
-          <w:tblCellMar>
-            <w:top w:w="0" w:type="dxa"/>
-            <w:bottom w:w="0" w:type="dxa"/>
-          </w:tblCellMar>
-        </w:tblPrEx>
         <w:tc>
           <w:tcPr>
             <w:tcW w:w="2600" w:type="dxa"/>
@@ -8736,12 +8437,6 @@
         </w:tc>
       </w:tr>
       <w:tr>
-        <w:tblPrEx>
-          <w:tblCellMar>
-            <w:top w:w="0" w:type="dxa"/>
-            <w:bottom w:w="0" w:type="dxa"/>
-          </w:tblCellMar>
-        </w:tblPrEx>
         <w:tc>
           <w:tcPr>
             <w:tcW w:w="2600" w:type="dxa"/>
@@ -8788,12 +8483,6 @@
         </w:tc>
       </w:tr>
       <w:tr>
-        <w:tblPrEx>
-          <w:tblCellMar>
-            <w:top w:w="0" w:type="dxa"/>
-            <w:bottom w:w="0" w:type="dxa"/>
-          </w:tblCellMar>
-        </w:tblPrEx>
         <w:tc>
           <w:tcPr>
             <w:tcW w:w="2600" w:type="dxa"/>
@@ -8838,12 +8527,6 @@
         </w:tc>
       </w:tr>
       <w:tr>
-        <w:tblPrEx>
-          <w:tblCellMar>
-            <w:top w:w="0" w:type="dxa"/>
-            <w:bottom w:w="0" w:type="dxa"/>
-          </w:tblCellMar>
-        </w:tblPrEx>
         <w:tc>
           <w:tcPr>
             <w:tcW w:w="2600" w:type="dxa"/>
@@ -8890,12 +8573,6 @@
         </w:tc>
       </w:tr>
       <w:tr>
-        <w:tblPrEx>
-          <w:tblCellMar>
-            <w:top w:w="0" w:type="dxa"/>
-            <w:bottom w:w="0" w:type="dxa"/>
-          </w:tblCellMar>
-        </w:tblPrEx>
         <w:tc>
           <w:tcPr>
             <w:tcW w:w="2600" w:type="dxa"/>
@@ -8940,12 +8617,6 @@
         </w:tc>
       </w:tr>
       <w:tr>
-        <w:tblPrEx>
-          <w:tblCellMar>
-            <w:top w:w="0" w:type="dxa"/>
-            <w:bottom w:w="0" w:type="dxa"/>
-          </w:tblCellMar>
-        </w:tblPrEx>
         <w:tc>
           <w:tcPr>
             <w:tcW w:w="2600" w:type="dxa"/>
@@ -8992,12 +8663,6 @@
         </w:tc>
       </w:tr>
       <w:tr>
-        <w:tblPrEx>
-          <w:tblCellMar>
-            <w:top w:w="0" w:type="dxa"/>
-            <w:bottom w:w="0" w:type="dxa"/>
-          </w:tblCellMar>
-        </w:tblPrEx>
         <w:tc>
           <w:tcPr>
             <w:tcW w:w="2600" w:type="dxa"/>
@@ -9042,12 +8707,6 @@
         </w:tc>
       </w:tr>
       <w:tr>
-        <w:tblPrEx>
-          <w:tblCellMar>
-            <w:top w:w="0" w:type="dxa"/>
-            <w:bottom w:w="0" w:type="dxa"/>
-          </w:tblCellMar>
-        </w:tblPrEx>
         <w:tc>
           <w:tcPr>
             <w:tcW w:w="2600" w:type="dxa"/>
@@ -9096,7 +8755,7 @@
     </w:tbl>
     <w:p>
       <w:pPr>
-        <w:pStyle w:val="Ttulo1"/>
+        <w:pStyle w:val="Heading1"/>
         <w:pBdr>
           <w:bottom w:val="single" w:sz="6" w:space="0" w:color="1F3864"/>
         </w:pBdr>
@@ -9132,7 +8791,7 @@
     </w:p>
     <w:p>
       <w:pPr>
-        <w:pStyle w:val="Prrafodelista"/>
+        <w:pStyle w:val="ListParagraph"/>
         <w:numPr>
           <w:ilvl w:val="0"/>
           <w:numId w:val="2"/>
@@ -9145,7 +8804,7 @@
     </w:p>
     <w:p>
       <w:pPr>
-        <w:pStyle w:val="Prrafodelista"/>
+        <w:pStyle w:val="ListParagraph"/>
         <w:numPr>
           <w:ilvl w:val="0"/>
           <w:numId w:val="2"/>
@@ -9206,15 +8865,7 @@
         <w:sz w:val="16"/>
         <w:szCs w:val="16"/>
       </w:rPr>
-      <w:t xml:space="preserve">Bodegas </w:t>
-    </w:r>
-    <w:r>
-      <w:rPr>
-        <w:color w:val="595959"/>
-        <w:sz w:val="16"/>
-        <w:szCs w:val="16"/>
-      </w:rPr>
-      <w:t xml:space="preserve">y </w:t>
+      <w:t xml:space="preserve">Bodegas y </w:t>
     </w:r>
     <w:r>
       <w:rPr>
@@ -10006,7 +9657,7 @@
     <w:name w:val="Normal"/>
     <w:qFormat/>
   </w:style>
-  <w:style w:type="paragraph" w:styleId="Ttulo1">
+  <w:style w:type="paragraph" w:styleId="Heading1">
     <w:name w:val="heading 1"/>
     <w:uiPriority w:val="9"/>
     <w:qFormat/>
@@ -10019,7 +9670,7 @@
       <w:szCs w:val="32"/>
     </w:rPr>
   </w:style>
-  <w:style w:type="paragraph" w:styleId="Ttulo2">
+  <w:style w:type="paragraph" w:styleId="Heading2">
     <w:name w:val="heading 2"/>
     <w:uiPriority w:val="9"/>
     <w:unhideWhenUsed/>
@@ -10033,7 +9684,7 @@
       <w:szCs w:val="26"/>
     </w:rPr>
   </w:style>
-  <w:style w:type="paragraph" w:styleId="Ttulo3">
+  <w:style w:type="paragraph" w:styleId="Heading3">
     <w:name w:val="heading 3"/>
     <w:uiPriority w:val="9"/>
     <w:semiHidden/>
@@ -10048,7 +9699,7 @@
       <w:szCs w:val="24"/>
     </w:rPr>
   </w:style>
-  <w:style w:type="paragraph" w:styleId="Ttulo4">
+  <w:style w:type="paragraph" w:styleId="Heading4">
     <w:name w:val="heading 4"/>
     <w:uiPriority w:val="9"/>
     <w:semiHidden/>
@@ -10063,7 +9714,7 @@
       <w:color w:val="2E74B5"/>
     </w:rPr>
   </w:style>
-  <w:style w:type="paragraph" w:styleId="Ttulo5">
+  <w:style w:type="paragraph" w:styleId="Heading5">
     <w:name w:val="heading 5"/>
     <w:uiPriority w:val="9"/>
     <w:semiHidden/>
@@ -10076,7 +9727,7 @@
       <w:color w:val="2E74B5"/>
     </w:rPr>
   </w:style>
-  <w:style w:type="paragraph" w:styleId="Ttulo6">
+  <w:style w:type="paragraph" w:styleId="Heading6">
     <w:name w:val="heading 6"/>
     <w:uiPriority w:val="9"/>
     <w:semiHidden/>
@@ -10089,12 +9740,12 @@
       <w:color w:val="1F4D78"/>
     </w:rPr>
   </w:style>
-  <w:style w:type="character" w:default="1" w:styleId="Fuentedeprrafopredeter">
+  <w:style w:type="character" w:default="1" w:styleId="DefaultParagraphFont">
     <w:name w:val="Default Paragraph Font"/>
     <w:uiPriority w:val="1"/>
     <w:unhideWhenUsed/>
   </w:style>
-  <w:style w:type="table" w:default="1" w:styleId="Tablanormal">
+  <w:style w:type="table" w:default="1" w:styleId="TableNormal">
     <w:name w:val="Normal Table"/>
     <w:uiPriority w:val="99"/>
     <w:semiHidden/>
@@ -10109,13 +9760,13 @@
       </w:tblCellMar>
     </w:tblPr>
   </w:style>
-  <w:style w:type="numbering" w:default="1" w:styleId="Sinlista">
+  <w:style w:type="numbering" w:default="1" w:styleId="NoList">
     <w:name w:val="No List"/>
     <w:uiPriority w:val="99"/>
     <w:semiHidden/>
     <w:unhideWhenUsed/>
   </w:style>
-  <w:style w:type="paragraph" w:styleId="Ttulo">
+  <w:style w:type="paragraph" w:styleId="Title">
     <w:name w:val="Title"/>
     <w:uiPriority w:val="10"/>
     <w:qFormat/>
@@ -10132,11 +9783,11 @@
       <w:bCs/>
     </w:rPr>
   </w:style>
-  <w:style w:type="paragraph" w:styleId="Prrafodelista">
+  <w:style w:type="paragraph" w:styleId="ListParagraph">
     <w:name w:val="List Paragraph"/>
     <w:qFormat/>
   </w:style>
-  <w:style w:type="character" w:styleId="Hipervnculo">
+  <w:style w:type="character" w:styleId="Hyperlink">
     <w:name w:val="Hyperlink"/>
     <w:uiPriority w:val="99"/>
     <w:unhideWhenUsed/>
@@ -10145,7 +9796,7 @@
       <w:u w:val="single"/>
     </w:rPr>
   </w:style>
-  <w:style w:type="character" w:styleId="Refdenotaalpie">
+  <w:style w:type="character" w:styleId="FootnoteReference">
     <w:name w:val="footnote reference"/>
     <w:uiPriority w:val="99"/>
     <w:semiHidden/>
@@ -10154,9 +9805,9 @@
       <w:vertAlign w:val="superscript"/>
     </w:rPr>
   </w:style>
-  <w:style w:type="paragraph" w:styleId="Textonotapie">
+  <w:style w:type="paragraph" w:styleId="FootnoteText">
     <w:name w:val="footnote text"/>
-    <w:link w:val="TextonotapieCar"/>
+    <w:link w:val="FootnoteTextChar"/>
     <w:uiPriority w:val="99"/>
     <w:semiHidden/>
     <w:unhideWhenUsed/>
@@ -10165,9 +9816,9 @@
       <w:szCs w:val="20"/>
     </w:rPr>
   </w:style>
-  <w:style w:type="character" w:customStyle="1" w:styleId="TextonotapieCar">
-    <w:name w:val="Texto nota pie Car"/>
-    <w:link w:val="Textonotapie"/>
+  <w:style w:type="character" w:customStyle="1" w:styleId="FootnoteTextChar">
+    <w:name w:val="Footnote Text Char"/>
+    <w:link w:val="FootnoteText"/>
     <w:uiPriority w:val="99"/>
     <w:semiHidden/>
     <w:unhideWhenUsed/>
@@ -10176,7 +9827,7 @@
       <w:szCs w:val="20"/>
     </w:rPr>
   </w:style>
-  <w:style w:type="character" w:styleId="Refdenotaalfinal">
+  <w:style w:type="character" w:styleId="EndnoteReference">
     <w:name w:val="endnote reference"/>
     <w:uiPriority w:val="99"/>
     <w:semiHidden/>
@@ -10185,9 +9836,9 @@
       <w:vertAlign w:val="superscript"/>
     </w:rPr>
   </w:style>
-  <w:style w:type="paragraph" w:styleId="Textonotaalfinal">
+  <w:style w:type="paragraph" w:styleId="EndnoteText">
     <w:name w:val="endnote text"/>
-    <w:link w:val="TextonotaalfinalCar"/>
+    <w:link w:val="EndnoteTextChar"/>
     <w:uiPriority w:val="99"/>
     <w:semiHidden/>
     <w:unhideWhenUsed/>
@@ -10196,9 +9847,9 @@
       <w:szCs w:val="20"/>
     </w:rPr>
   </w:style>
-  <w:style w:type="character" w:customStyle="1" w:styleId="TextonotaalfinalCar">
-    <w:name w:val="Texto nota al final Car"/>
-    <w:link w:val="Textonotaalfinal"/>
+  <w:style w:type="character" w:customStyle="1" w:styleId="EndnoteTextChar">
+    <w:name w:val="Endnote Text Char"/>
+    <w:link w:val="EndnoteText"/>
     <w:uiPriority w:val="99"/>
     <w:semiHidden/>
     <w:unhideWhenUsed/>
@@ -10207,7 +9858,7 @@
       <w:szCs w:val="20"/>
     </w:rPr>
   </w:style>
-  <w:style w:type="paragraph" w:styleId="TDC1">
+  <w:style w:type="paragraph" w:styleId="TOC1">
     <w:name w:val="toc 1"/>
     <w:basedOn w:val="Normal"/>
     <w:next w:val="Normal"/>
@@ -10219,7 +9870,7 @@
       <w:spacing w:after="100"/>
     </w:pPr>
   </w:style>
-  <w:style w:type="paragraph" w:styleId="TDC2">
+  <w:style w:type="paragraph" w:styleId="TOC2">
     <w:name w:val="toc 2"/>
     <w:basedOn w:val="Normal"/>
     <w:next w:val="Normal"/>
@@ -10232,10 +9883,10 @@
       <w:ind w:left="210"/>
     </w:pPr>
   </w:style>
-  <w:style w:type="paragraph" w:styleId="Encabezado">
+  <w:style w:type="paragraph" w:styleId="Header">
     <w:name w:val="header"/>
     <w:basedOn w:val="Normal"/>
-    <w:link w:val="EncabezadoCar"/>
+    <w:link w:val="HeaderChar"/>
     <w:uiPriority w:val="99"/>
     <w:unhideWhenUsed/>
     <w:rsid w:val="00153083"/>
@@ -10246,17 +9897,17 @@
       </w:tabs>
     </w:pPr>
   </w:style>
-  <w:style w:type="character" w:customStyle="1" w:styleId="EncabezadoCar">
-    <w:name w:val="Encabezado Car"/>
-    <w:basedOn w:val="Fuentedeprrafopredeter"/>
-    <w:link w:val="Encabezado"/>
+  <w:style w:type="character" w:customStyle="1" w:styleId="HeaderChar">
+    <w:name w:val="Header Char"/>
+    <w:basedOn w:val="DefaultParagraphFont"/>
+    <w:link w:val="Header"/>
     <w:uiPriority w:val="99"/>
     <w:rsid w:val="00153083"/>
   </w:style>
-  <w:style w:type="paragraph" w:styleId="Piedepgina">
+  <w:style w:type="paragraph" w:styleId="Footer">
     <w:name w:val="footer"/>
     <w:basedOn w:val="Normal"/>
-    <w:link w:val="PiedepginaCar"/>
+    <w:link w:val="FooterChar"/>
     <w:uiPriority w:val="99"/>
     <w:unhideWhenUsed/>
     <w:rsid w:val="00153083"/>
@@ -10267,10 +9918,10 @@
       </w:tabs>
     </w:pPr>
   </w:style>
-  <w:style w:type="character" w:customStyle="1" w:styleId="PiedepginaCar">
-    <w:name w:val="Pie de página Car"/>
-    <w:basedOn w:val="Fuentedeprrafopredeter"/>
-    <w:link w:val="Piedepgina"/>
+  <w:style w:type="character" w:customStyle="1" w:styleId="FooterChar">
+    <w:name w:val="Footer Char"/>
+    <w:basedOn w:val="DefaultParagraphFont"/>
+    <w:link w:val="Footer"/>
     <w:uiPriority w:val="99"/>
     <w:rsid w:val="00153083"/>
   </w:style>

</xml_diff>